<commit_message>
deploy: switch demo domain to 3blue1brownlab.cn (reuse existing SSL)
Co-authored-by: Cursor <cursoragent@cursor.com>
</commit_message>
<xml_diff>
--- a/submission/03_正式文档_WORD/02_生产级测试报告.docx
+++ b/submission/03_正式文档_WORD/02_生产级测试报告.docx
@@ -146,7 +146,7 @@
                 <w:b w:val="0"/>
                 <w:sz w:val="19"/>
               </w:rPr>
-              <w:t>https://quantinsight.cn</w:t>
+              <w:t>https://3blue1brownlab.cn</w:t>
             </w:r>
           </w:p>
         </w:tc>
@@ -268,7 +268,7 @@
                 <w:b w:val="0"/>
                 <w:sz w:val="19"/>
               </w:rPr>
-              <w:t>2026-07-07 19:04</w:t>
+              <w:t>2026-07-07 19:48</w:t>
             </w:r>
           </w:p>
         </w:tc>

</xml_diff>